<commit_message>
Add extended repair results and C&IE manuscript
</commit_message>
<xml_diff>
--- a/paper/highlights.docx
+++ b/paper/highlights.docx
@@ -60,7 +60,7 @@
           <w:sz w:val="24"/>
         </w:rPr>
         <w:tab/>
-        <w:t>Every method starts from the same verified feasible layout and keeps it.</w:t>
+        <w:t>Partial repair reuses feasible witness geometry after each proposed placement.</w:t>
       </w:r>
     </w:p>
     <w:p>
@@ -89,7 +89,7 @@
           <w:sz w:val="24"/>
         </w:rPr>
         <w:tab/>
-        <w:t>Partial repair reuses witness geometry after a proposed placement.</w:t>
+        <w:t>A paired study tests 32 to 256 facilities with budgets through 60 seconds.</w:t>
       </w:r>
     </w:p>
     <w:p>
@@ -118,7 +118,7 @@
           <w:sz w:val="24"/>
         </w:rPr>
         <w:tab/>
-        <w:t>It improves matched-time quality at fill 0.95 in two geometry families.</w:t>
+        <w:t>M1 exceeds the selected ALNS control at 95% fill at 10 and 60 seconds.</w:t>
       </w:r>
     </w:p>
     <w:p>
@@ -147,7 +147,7 @@
           <w:sz w:val="24"/>
         </w:rPr>
         <w:tab/>
-        <w:t>Reuse-only and small-destroy controls isolate the repair mechanism.</w:t>
+        <w:t>At 256 facilities, M1 leads M0 at 10 seconds; M0 leads at 60 seconds.</w:t>
       </w:r>
     </w:p>
     <w:p>
@@ -176,7 +176,7 @@
           <w:sz w:val="24"/>
         </w:rPr>
         <w:tab/>
-        <w:t>No advantage over full regeneration is established at one second.</w:t>
+        <w:t>Reuse-only controls isolate the contribution of nonempty repairs.</w:t>
       </w:r>
     </w:p>
     <w:sectPr>

</xml_diff>